<commit_message>
feat: Unit 3 board game (Grade 3 It Keeps Changing / Bear and I, Grade 4 Money) and swap the Unit 3 grade labels
Question-to-buy board game for 3 or 4 teams (about 25 minutes, rent, Chance cards, podium with XP). Library, timetable and Today lists, plans and Games Guide now put money in Grade 4 and It Keeps Changing in Grade 3.

Co-Authored-By: Claude Sonnet 5.5 <noreply@anthropic.com>
</commit_message>
<xml_diff>
--- a/lesson-plans/Unit3-Games-Guide.docx
+++ b/lesson-plans/Unit3-Games-Guide.docx
@@ -18,7 +18,7 @@
         <w:rPr>
           <w:color w:val="475569"/>
         </w:rPr>
-        <w:t xml:space="preserve">Grade 3: How Much Is It? (money) · Grade 4: It Keeps Changing (the Arctic poem and Clean Cars). All games open on the smartboard in a browser; no printing is needed. Every link starts with https://maysaaaam-rgb.github.io/who-stole-the-treasure/</w:t>
+        <w:t xml:space="preserve">Grade 3: It Keeps Changing (the Arctic poem and Clean Cars) · Grade 4: How Much Is It? (money). All games open on the smartboard in a browser; no printing is needed. Every link starts with https://maysaaaam-rgb.github.io/who-stole-the-treasure/</w:t>
       </w:r>
     </w:p>
     <w:p>
@@ -91,7 +91,7 @@
     </w:p>
     <w:p>
       <w:pPr>
-        <w:spacing w:before="40" w:after="40"/>
+        <w:spacing w:after="40" w:before="40"/>
       </w:pPr>
       <w:r>
         <w:rPr>
@@ -110,10 +110,10 @@
       </w:pPr>
       <w:r>
         <w:rPr>
+          <w:rFonts w:ascii="Consolas" w:cs="Consolas" w:eastAsia="Consolas" w:hAnsi="Consolas"/>
           <w:color w:val="0369A1"/>
           <w:sz w:val="18"/>
           <w:szCs w:val="18"/>
-          <w:rFonts w:ascii="Consolas" w:cs="Consolas" w:eastAsia="Consolas" w:hAnsi="Consolas"/>
         </w:rPr>
         <w:t xml:space="preserve">https://maysaaaam-rgb.github.io/who-stole-the-treasure/unit2-throw/index.html?unit=3</w:t>
       </w:r>
@@ -188,7 +188,7 @@
     </w:p>
     <w:p>
       <w:pPr>
-        <w:spacing w:before="40" w:after="40"/>
+        <w:spacing w:after="40" w:before="40"/>
       </w:pPr>
       <w:r>
         <w:rPr>
@@ -207,24 +207,24 @@
       </w:pPr>
       <w:r>
         <w:rPr>
+          <w:rFonts w:ascii="Consolas" w:cs="Consolas" w:eastAsia="Consolas" w:hAnsi="Consolas"/>
           <w:color w:val="0369A1"/>
           <w:sz w:val="18"/>
           <w:szCs w:val="18"/>
+        </w:rPr>
+        <w:t xml:space="preserve">https://maysaaaam-rgb.github.io/who-stole-the-treasure/bamboozle/index.html?grade=3&amp;unit=3</w:t>
+      </w:r>
+    </w:p>
+    <w:p>
+      <w:pPr>
+        <w:spacing w:after="30"/>
+      </w:pPr>
+      <w:r>
+        <w:rPr>
           <w:rFonts w:ascii="Consolas" w:cs="Consolas" w:eastAsia="Consolas" w:hAnsi="Consolas"/>
-        </w:rPr>
-        <w:t xml:space="preserve">https://maysaaaam-rgb.github.io/who-stole-the-treasure/bamboozle/index.html?grade=3&amp;unit=3</w:t>
-      </w:r>
-    </w:p>
-    <w:p>
-      <w:pPr>
-        <w:spacing w:after="30"/>
-      </w:pPr>
-      <w:r>
-        <w:rPr>
           <w:color w:val="0369A1"/>
           <w:sz w:val="18"/>
           <w:szCs w:val="18"/>
-          <w:rFonts w:ascii="Consolas" w:cs="Consolas" w:eastAsia="Consolas" w:hAnsi="Consolas"/>
         </w:rPr>
         <w:t xml:space="preserve">https://maysaaaam-rgb.github.io/who-stole-the-treasure/bamboozle/index.html?grade=4&amp;unit=3</w:t>
       </w:r>
@@ -299,7 +299,7 @@
     </w:p>
     <w:p>
       <w:pPr>
-        <w:spacing w:before="40" w:after="40"/>
+        <w:spacing w:after="40" w:before="40"/>
       </w:pPr>
       <w:r>
         <w:rPr>
@@ -318,24 +318,24 @@
       </w:pPr>
       <w:r>
         <w:rPr>
+          <w:rFonts w:ascii="Consolas" w:cs="Consolas" w:eastAsia="Consolas" w:hAnsi="Consolas"/>
           <w:color w:val="0369A1"/>
           <w:sz w:val="18"/>
           <w:szCs w:val="18"/>
+        </w:rPr>
+        <w:t xml:space="preserve">https://maysaaaam-rgb.github.io/who-stole-the-treasure/unit2-revision/index.html?grade=3&amp;unit=3</w:t>
+      </w:r>
+    </w:p>
+    <w:p>
+      <w:pPr>
+        <w:spacing w:after="30"/>
+      </w:pPr>
+      <w:r>
+        <w:rPr>
           <w:rFonts w:ascii="Consolas" w:cs="Consolas" w:eastAsia="Consolas" w:hAnsi="Consolas"/>
-        </w:rPr>
-        <w:t xml:space="preserve">https://maysaaaam-rgb.github.io/who-stole-the-treasure/unit2-revision/index.html?grade=3&amp;unit=3</w:t>
-      </w:r>
-    </w:p>
-    <w:p>
-      <w:pPr>
-        <w:spacing w:after="30"/>
-      </w:pPr>
-      <w:r>
-        <w:rPr>
           <w:color w:val="0369A1"/>
           <w:sz w:val="18"/>
           <w:szCs w:val="18"/>
-          <w:rFonts w:ascii="Consolas" w:cs="Consolas" w:eastAsia="Consolas" w:hAnsi="Consolas"/>
         </w:rPr>
         <w:t xml:space="preserve">https://maysaaaam-rgb.github.io/who-stole-the-treasure/unit2-revision/index.html?grade=4&amp;unit=3</w:t>
       </w:r>
@@ -410,7 +410,7 @@
     </w:p>
     <w:p>
       <w:pPr>
-        <w:spacing w:before="40" w:after="40"/>
+        <w:spacing w:after="40" w:before="40"/>
       </w:pPr>
       <w:r>
         <w:rPr>
@@ -429,24 +429,24 @@
       </w:pPr>
       <w:r>
         <w:rPr>
+          <w:rFonts w:ascii="Consolas" w:cs="Consolas" w:eastAsia="Consolas" w:hAnsi="Consolas"/>
           <w:color w:val="0369A1"/>
           <w:sz w:val="18"/>
           <w:szCs w:val="18"/>
+        </w:rPr>
+        <w:t xml:space="preserve">https://maysaaaam-rgb.github.io/who-stole-the-treasure/unit2-arcade/index.html?grade=3&amp;unit=3</w:t>
+      </w:r>
+    </w:p>
+    <w:p>
+      <w:pPr>
+        <w:spacing w:after="30"/>
+      </w:pPr>
+      <w:r>
+        <w:rPr>
           <w:rFonts w:ascii="Consolas" w:cs="Consolas" w:eastAsia="Consolas" w:hAnsi="Consolas"/>
-        </w:rPr>
-        <w:t xml:space="preserve">https://maysaaaam-rgb.github.io/who-stole-the-treasure/unit2-arcade/index.html?grade=3&amp;unit=3</w:t>
-      </w:r>
-    </w:p>
-    <w:p>
-      <w:pPr>
-        <w:spacing w:after="30"/>
-      </w:pPr>
-      <w:r>
-        <w:rPr>
           <w:color w:val="0369A1"/>
           <w:sz w:val="18"/>
           <w:szCs w:val="18"/>
-          <w:rFonts w:ascii="Consolas" w:cs="Consolas" w:eastAsia="Consolas" w:hAnsi="Consolas"/>
         </w:rPr>
         <w:t xml:space="preserve">https://maysaaaam-rgb.github.io/who-stole-the-treasure/unit2-arcade/index.html?grade=4&amp;unit=3</w:t>
       </w:r>
@@ -469,7 +469,7 @@
           <w:b/>
           <w:bCs/>
         </w:rPr>
-        <w:t xml:space="preserve">Grade 3 · 10-15 min</w:t>
+        <w:t xml:space="preserve">Grade 4 · 10-15 min</w:t>
       </w:r>
     </w:p>
     <w:p>
@@ -521,7 +521,7 @@
     </w:p>
     <w:p>
       <w:pPr>
-        <w:spacing w:before="40" w:after="40"/>
+        <w:spacing w:after="40" w:before="40"/>
       </w:pPr>
       <w:r>
         <w:rPr>
@@ -540,10 +540,10 @@
       </w:pPr>
       <w:r>
         <w:rPr>
+          <w:rFonts w:ascii="Consolas" w:cs="Consolas" w:eastAsia="Consolas" w:hAnsi="Consolas"/>
           <w:color w:val="0369A1"/>
           <w:sz w:val="18"/>
           <w:szCs w:val="18"/>
-          <w:rFonts w:ascii="Consolas" w:cs="Consolas" w:eastAsia="Consolas" w:hAnsi="Consolas"/>
         </w:rPr>
         <w:t xml:space="preserve">https://maysaaaam-rgb.github.io/who-stole-the-treasure/unit3-shop/index.html</w:t>
       </w:r>
@@ -554,7 +554,7 @@
         <w:spacing w:before="200"/>
       </w:pPr>
       <w:r>
-        <w:t xml:space="preserve">🚗 Clean Cars lesson (Grade 4, Lesson 5)</w:t>
+        <w:t xml:space="preserve">🚗 Clean Cars lesson (Grade 3, Lesson 5)</w:t>
       </w:r>
     </w:p>
     <w:p>
@@ -566,7 +566,7 @@
           <w:b/>
           <w:bCs/>
         </w:rPr>
-        <w:t xml:space="preserve">Grade 4 · 40 min</w:t>
+        <w:t xml:space="preserve">Grade 3 · 40 min</w:t>
       </w:r>
     </w:p>
     <w:p>
@@ -618,7 +618,7 @@
     </w:p>
     <w:p>
       <w:pPr>
-        <w:spacing w:before="40" w:after="40"/>
+        <w:spacing w:after="40" w:before="40"/>
       </w:pPr>
       <w:r>
         <w:rPr>
@@ -637,10 +637,10 @@
       </w:pPr>
       <w:r>
         <w:rPr>
+          <w:rFonts w:ascii="Consolas" w:cs="Consolas" w:eastAsia="Consolas" w:hAnsi="Consolas"/>
           <w:color w:val="0369A1"/>
           <w:sz w:val="18"/>
           <w:szCs w:val="18"/>
-          <w:rFonts w:ascii="Consolas" w:cs="Consolas" w:eastAsia="Consolas" w:hAnsi="Consolas"/>
         </w:rPr>
         <w:t xml:space="preserve">https://maysaaaam-rgb.github.io/who-stole-the-treasure/unit3-g4-lessons/index.html?lesson=5</w:t>
       </w:r>
@@ -668,8 +668,41 @@
 </w:document>
 </file>
 
-<file path=word/comments.xml><?xml version="1.0" encoding="utf-8"?>
-<w:comments xmlns:cx="http://schemas.microsoft.com/office/drawing/2014/chartex" xmlns:cx1="http://schemas.microsoft.com/office/drawing/2015/9/8/chartex" xmlns:cx2="http://schemas.microsoft.com/office/drawing/2015/10/21/chartex" xmlns:cx3="http://schemas.microsoft.com/office/drawing/2016/5/9/chartex" xmlns:cx4="http://schemas.microsoft.com/office/drawing/2016/5/10/chartex" xmlns:cx5="http://schemas.microsoft.com/office/drawing/2016/5/11/chartex" xmlns:cx6="http://schemas.microsoft.com/office/drawing/2016/5/12/chartex" xmlns:cx7="http://schemas.microsoft.com/office/drawing/2016/5/13/chartex" xmlns:cx8="http://schemas.microsoft.com/office/drawing/2016/5/14/chartex" xmlns:mc="http://schemas.openxmlformats.org/markup-compatibility/2006" xmlns:aink="http://schemas.microsoft.com/office/drawing/2016/ink" xmlns:am3d="http://schemas.microsoft.com/office/drawing/2017/model3d" xmlns:o="urn:schemas-microsoft-com:office:office" xmlns:r="http://schemas.openxmlformats.org/officeDocument/2006/relationships" xmlns:m="http://schemas.openxmlformats.org/officeDocument/2006/math" xmlns:v="urn:schemas-microsoft-com:vml" xmlns:wp14="http://schemas.microsoft.com/office/word/2010/wordprocessingDrawing" xmlns:wp="http://schemas.openxmlformats.org/drawingml/2006/wordprocessingDrawing" xmlns:w10="urn:schemas-microsoft-com:office:word" xmlns:w="http://schemas.openxmlformats.org/wordprocessingml/2006/main" xmlns:w14="http://schemas.microsoft.com/office/word/2010/wordml" xmlns:w15="http://schemas.microsoft.com/office/word/2012/wordml" xmlns:w16cex="http://schemas.microsoft.com/office/word/2018/wordml/cex" xmlns:w16cid="http://schemas.microsoft.com/office/word/2016/wordml/cid" xmlns:w16="http://schemas.microsoft.com/office/word/2018/wordml" xmlns:w16sdtdh="http://schemas.microsoft.com/office/word/2020/wordml/sdtdatahash" xmlns:w16se="http://schemas.microsoft.com/office/word/2015/wordml/symex" xmlns:wpg="http://schemas.microsoft.com/office/word/2010/wordprocessingGroup" xmlns:wpi="http://schemas.microsoft.com/office/word/2010/wordprocessingInk" xmlns:wne="http://schemas.microsoft.com/office/word/2006/wordml" xmlns:wps="http://schemas.microsoft.com/office/word/2010/wordprocessingShape"/>
+<file path=word/endnotes.xml><?xml version="1.0" encoding="utf-8"?>
+<w:endnotes xmlns:wpc="http://schemas.microsoft.com/office/word/2010/wordprocessingCanvas" xmlns:mc="http://schemas.openxmlformats.org/markup-compatibility/2006" xmlns:o="urn:schemas-microsoft-com:office:office" xmlns:r="http://schemas.openxmlformats.org/officeDocument/2006/relationships" xmlns:m="http://schemas.openxmlformats.org/officeDocument/2006/math" xmlns:v="urn:schemas-microsoft-com:vml" xmlns:wp14="http://schemas.microsoft.com/office/word/2010/wordprocessingDrawing" xmlns:wp="http://schemas.openxmlformats.org/drawingml/2006/wordprocessingDrawing" xmlns:w10="urn:schemas-microsoft-com:office:word" xmlns:w="http://schemas.openxmlformats.org/wordprocessingml/2006/main" xmlns:w14="http://schemas.microsoft.com/office/word/2010/wordml" xmlns:w15="http://schemas.microsoft.com/office/word/2012/wordml" xmlns:wpg="http://schemas.microsoft.com/office/word/2010/wordprocessingGroup" xmlns:wpi="http://schemas.microsoft.com/office/word/2010/wordprocessingInk" xmlns:wne="http://schemas.microsoft.com/office/word/2006/wordml" xmlns:wps="http://schemas.microsoft.com/office/word/2010/wordprocessingShape" mc:Ignorable="w14 w15 wp14">
+  <w:endnote w:type="separator" w:id="-1">
+    <w:p>
+      <w:pPr>
+        <w:spacing w:after="0" w:line="240" w:lineRule="auto"/>
+      </w:pPr>
+      <w:r>
+        <w:rPr>
+          <w:rStyle w:val="EndnoteReference"/>
+        </w:rPr>
+        <w:endnoteRef/>
+      </w:r>
+      <w:r>
+        <w:separator/>
+      </w:r>
+    </w:p>
+  </w:endnote>
+  <w:endnote w:type="continuationSeparator" w:id="0">
+    <w:p>
+      <w:pPr>
+        <w:spacing w:after="0" w:line="240" w:lineRule="auto"/>
+      </w:pPr>
+      <w:r>
+        <w:rPr>
+          <w:rStyle w:val="EndnoteReference"/>
+        </w:rPr>
+        <w:endnoteRef/>
+      </w:r>
+      <w:r>
+        <w:continuationSeparator/>
+      </w:r>
+    </w:p>
+  </w:endnote>
+</w:endnotes>
 </file>
 
 <file path=word/footnotes.xml><?xml version="1.0" encoding="utf-8"?>
@@ -713,7 +746,7 @@
 <w:numbering xmlns:wpc="http://schemas.microsoft.com/office/word/2010/wordprocessingCanvas" xmlns:mc="http://schemas.openxmlformats.org/markup-compatibility/2006" xmlns:o="urn:schemas-microsoft-com:office:office" xmlns:r="http://schemas.openxmlformats.org/officeDocument/2006/relationships" xmlns:m="http://schemas.openxmlformats.org/officeDocument/2006/math" xmlns:v="urn:schemas-microsoft-com:vml" xmlns:wp14="http://schemas.microsoft.com/office/word/2010/wordprocessingDrawing" xmlns:wp="http://schemas.openxmlformats.org/drawingml/2006/wordprocessingDrawing" xmlns:w10="urn:schemas-microsoft-com:office:word" xmlns:w="http://schemas.openxmlformats.org/wordprocessingml/2006/main" xmlns:w14="http://schemas.microsoft.com/office/word/2010/wordml" xmlns:w15="http://schemas.microsoft.com/office/word/2012/wordml" xmlns:wpg="http://schemas.microsoft.com/office/word/2010/wordprocessingGroup" xmlns:wpi="http://schemas.microsoft.com/office/word/2010/wordprocessingInk" xmlns:wne="http://schemas.microsoft.com/office/word/2006/wordml" xmlns:wps="http://schemas.microsoft.com/office/word/2010/wordprocessingShape" mc:Ignorable="w14 w15 wp14">
   <w:abstractNum w:abstractNumId="1" w15:restartNumberingAfterBreak="0">
     <w:multiLevelType w:val="hybridMultilevel"/>
-    <w:lvl w:ilvl="0" w15:tentative="1">
+    <w:lvl w:ilvl="0" w:tentative="1">
       <w:start w:val="1"/>
       <w:numFmt w:val="bullet"/>
       <w:lvlText w:val="●"/>
@@ -722,7 +755,7 @@
         <w:ind w:left="720" w:hanging="360"/>
       </w:pPr>
     </w:lvl>
-    <w:lvl w:ilvl="1" w15:tentative="1">
+    <w:lvl w:ilvl="1" w:tentative="1">
       <w:start w:val="1"/>
       <w:numFmt w:val="bullet"/>
       <w:lvlText w:val="○"/>
@@ -731,7 +764,7 @@
         <w:ind w:left="1440" w:hanging="360"/>
       </w:pPr>
     </w:lvl>
-    <w:lvl w:ilvl="2" w15:tentative="1">
+    <w:lvl w:ilvl="2" w:tentative="1">
       <w:start w:val="1"/>
       <w:numFmt w:val="bullet"/>
       <w:lvlText w:val="■"/>
@@ -740,7 +773,7 @@
         <w:ind w:left="2160" w:hanging="360"/>
       </w:pPr>
     </w:lvl>
-    <w:lvl w:ilvl="3" w15:tentative="1">
+    <w:lvl w:ilvl="3" w:tentative="1">
       <w:start w:val="1"/>
       <w:numFmt w:val="bullet"/>
       <w:lvlText w:val="●"/>
@@ -749,7 +782,7 @@
         <w:ind w:left="2880" w:hanging="360"/>
       </w:pPr>
     </w:lvl>
-    <w:lvl w:ilvl="4" w15:tentative="1">
+    <w:lvl w:ilvl="4" w:tentative="1">
       <w:start w:val="1"/>
       <w:numFmt w:val="bullet"/>
       <w:lvlText w:val="○"/>
@@ -758,7 +791,7 @@
         <w:ind w:left="3600" w:hanging="360"/>
       </w:pPr>
     </w:lvl>
-    <w:lvl w:ilvl="5" w15:tentative="1">
+    <w:lvl w:ilvl="5" w:tentative="1">
       <w:start w:val="1"/>
       <w:numFmt w:val="bullet"/>
       <w:lvlText w:val="■"/>
@@ -767,7 +800,7 @@
         <w:ind w:left="4320" w:hanging="360"/>
       </w:pPr>
     </w:lvl>
-    <w:lvl w:ilvl="6" w15:tentative="1">
+    <w:lvl w:ilvl="6" w:tentative="1">
       <w:start w:val="1"/>
       <w:numFmt w:val="bullet"/>
       <w:lvlText w:val="●"/>
@@ -776,7 +809,7 @@
         <w:ind w:left="5040" w:hanging="360"/>
       </w:pPr>
     </w:lvl>
-    <w:lvl w:ilvl="7" w15:tentative="1">
+    <w:lvl w:ilvl="7" w:tentative="1">
       <w:start w:val="1"/>
       <w:numFmt w:val="bullet"/>
       <w:lvlText w:val="●"/>
@@ -785,7 +818,7 @@
         <w:ind w:left="5760" w:hanging="360"/>
       </w:pPr>
     </w:lvl>
-    <w:lvl w:ilvl="8" w15:tentative="1">
+    <w:lvl w:ilvl="8" w:tentative="1">
       <w:start w:val="1"/>
       <w:numFmt w:val="bullet"/>
       <w:lvlText w:val="●"/>
@@ -809,13 +842,17 @@
   <w:docDefaults>
     <w:rPrDefault>
       <w:rPr>
+        <w:rFonts w:ascii="Calibri" w:cs="Calibri" w:eastAsia="Calibri" w:hAnsi="Calibri"/>
         <w:sz w:val="21"/>
         <w:szCs w:val="21"/>
-        <w:rFonts w:ascii="Calibri" w:cs="Calibri" w:eastAsia="Calibri" w:hAnsi="Calibri"/>
       </w:rPr>
     </w:rPrDefault>
     <w:pPrDefault/>
   </w:docDefaults>
+  <w:style w:type="paragraph" w:styleId="Normal" w:default="1">
+    <w:name w:val="Normal"/>
+    <w:qFormat/>
+  </w:style>
   <w:style w:type="paragraph" w:styleId="Title">
     <w:name w:val="Title"/>
     <w:basedOn w:val="Normal"/>
@@ -826,28 +863,6 @@
       <w:szCs w:val="56"/>
     </w:rPr>
   </w:style>
-  <w:style w:type="paragraph" w:styleId="Heading1">
-    <w:name w:val="Heading 1"/>
-    <w:basedOn w:val="Normal"/>
-    <w:next w:val="Normal"/>
-    <w:qFormat/>
-    <w:rPr>
-      <w:color w:val="2E74B5"/>
-      <w:sz w:val="32"/>
-      <w:szCs w:val="32"/>
-    </w:rPr>
-  </w:style>
-  <w:style w:type="paragraph" w:styleId="Heading2">
-    <w:name w:val="Heading 2"/>
-    <w:basedOn w:val="Normal"/>
-    <w:next w:val="Normal"/>
-    <w:qFormat/>
-    <w:rPr>
-      <w:color w:val="2E74B5"/>
-      <w:sz w:val="26"/>
-      <w:szCs w:val="26"/>
-    </w:rPr>
-  </w:style>
   <w:style w:type="paragraph" w:styleId="Heading3">
     <w:name w:val="Heading 3"/>
     <w:basedOn w:val="Normal"/>
@@ -909,8 +924,8 @@
     <w:uiPriority w:val="99"/>
     <w:unhideWhenUsed/>
     <w:rPr>
+      <w:color w:val="0563C1"/>
       <w:u w:val="single"/>
-      <w:color w:val="0563C1"/>
     </w:rPr>
   </w:style>
   <w:style w:type="character" w:styleId="FootnoteReference">
@@ -950,6 +965,43 @@
       <w:szCs w:val="20"/>
     </w:rPr>
   </w:style>
+  <w:style w:type="character" w:styleId="EndnoteReference">
+    <w:name w:val="endnote reference"/>
+    <w:basedOn w:val="DefaultParagraphFont"/>
+    <w:uiPriority w:val="99"/>
+    <w:semiHidden/>
+    <w:unhideWhenUsed/>
+    <w:rPr>
+      <w:vertAlign w:val="superscript"/>
+    </w:rPr>
+  </w:style>
+  <w:style w:type="paragraph" w:styleId="EndnoteText">
+    <w:name w:val="endnote text"/>
+    <w:basedOn w:val="Normal"/>
+    <w:link w:val="EndnoteTextChar"/>
+    <w:uiPriority w:val="99"/>
+    <w:semiHidden/>
+    <w:unhideWhenUsed/>
+    <w:pPr>
+      <w:spacing w:after="0" w:line="240" w:lineRule="auto"/>
+    </w:pPr>
+    <w:rPr>
+      <w:sz w:val="20"/>
+      <w:szCs w:val="20"/>
+    </w:rPr>
+  </w:style>
+  <w:style w:type="character" w:styleId="EndnoteTextChar">
+    <w:name w:val="Endnote Text Char"/>
+    <w:basedOn w:val="DefaultParagraphFont"/>
+    <w:link w:val="EndnoteText"/>
+    <w:uiPriority w:val="99"/>
+    <w:semiHidden/>
+    <w:unhideWhenUsed/>
+    <w:rPr>
+      <w:sz w:val="20"/>
+      <w:szCs w:val="20"/>
+    </w:rPr>
+  </w:style>
   <w:style w:type="paragraph" w:styleId="Heading1">
     <w:name w:val="Heading 1"/>
     <w:basedOn w:val="Normal"/>
@@ -983,4 +1035,294 @@
     </w:rPr>
   </w:style>
 </w:styles>
+</file>
+
+<file path=word/theme/theme1.xml><?xml version="1.0" encoding="utf-8"?>
+<a:theme xmlns:a="http://schemas.openxmlformats.org/drawingml/2006/main" name="Office Theme">
+  <a:themeElements>
+    <a:clrScheme name="Office">
+      <a:dk1>
+        <a:sysClr val="windowText" lastClr="000000"/>
+      </a:dk1>
+      <a:lt1>
+        <a:sysClr val="window" lastClr="FFFFFF"/>
+      </a:lt1>
+      <a:dk2>
+        <a:srgbClr val="44546A"/>
+      </a:dk2>
+      <a:lt2>
+        <a:srgbClr val="E7E6E6"/>
+      </a:lt2>
+      <a:accent1>
+        <a:srgbClr val="4472C4"/>
+      </a:accent1>
+      <a:accent2>
+        <a:srgbClr val="ED7D31"/>
+      </a:accent2>
+      <a:accent3>
+        <a:srgbClr val="A5A5A5"/>
+      </a:accent3>
+      <a:accent4>
+        <a:srgbClr val="FFC000"/>
+      </a:accent4>
+      <a:accent5>
+        <a:srgbClr val="5B9BD5"/>
+      </a:accent5>
+      <a:accent6>
+        <a:srgbClr val="70AD47"/>
+      </a:accent6>
+      <a:hlink>
+        <a:srgbClr val="0563C1"/>
+      </a:hlink>
+      <a:folHlink>
+        <a:srgbClr val="954F72"/>
+      </a:folHlink>
+    </a:clrScheme>
+    <a:fontScheme name="Office">
+      <a:majorFont>
+        <a:latin typeface="Calibri Light" panose="020F0302020204030204"/>
+        <a:ea typeface=""/>
+        <a:cs typeface=""/>
+        <a:font script="Jpan" typeface="游ゴシック Light"/>
+        <a:font script="Hang" typeface="맑은 고딕"/>
+        <a:font script="Hans" typeface="等线 Light"/>
+        <a:font script="Hant" typeface="新細明體"/>
+        <a:font script="Arab" typeface="Times New Roman"/>
+        <a:font script="Hebr" typeface="Times New Roman"/>
+        <a:font script="Thai" typeface="Angsana New"/>
+        <a:font script="Ethi" typeface="Nyala"/>
+        <a:font script="Beng" typeface="Vrinda"/>
+        <a:font script="Gujr" typeface="Shruti"/>
+        <a:font script="Khmr" typeface="MoolBoran"/>
+        <a:font script="Knda" typeface="Tunga"/>
+        <a:font script="Guru" typeface="Raavi"/>
+        <a:font script="Cans" typeface="Euphemia"/>
+        <a:font script="Cher" typeface="Plantagenet Cherokee"/>
+        <a:font script="Yiii" typeface="Microsoft Yi Baiti"/>
+        <a:font script="Tibt" typeface="Microsoft Himalaya"/>
+        <a:font script="Thaa" typeface="MV Boli"/>
+        <a:font script="Deva" typeface="Mangal"/>
+        <a:font script="Telu" typeface="Gautami"/>
+        <a:font script="Taml" typeface="Latha"/>
+        <a:font script="Syrc" typeface="Estrangelo Edessa"/>
+        <a:font script="Orya" typeface="Kalinga"/>
+        <a:font script="Mlym" typeface="Kartika"/>
+        <a:font script="Laoo" typeface="DokChampa"/>
+        <a:font script="Sinh" typeface="Iskoola Pota"/>
+        <a:font script="Mong" typeface="Mongolian Baiti"/>
+        <a:font script="Viet" typeface="Times New Roman"/>
+        <a:font script="Uigh" typeface="Microsoft Uighur"/>
+        <a:font script="Geor" typeface="Sylfaen"/>
+        <a:font script="Armn" typeface="Arial"/>
+        <a:font script="Bugi" typeface="Leelawadee UI"/>
+        <a:font script="Bopo" typeface="Microsoft JhengHei"/>
+        <a:font script="Java" typeface="Javanese Text"/>
+        <a:font script="Lisu" typeface="Segoe UI"/>
+        <a:font script="Mymr" typeface="Myanmar Text"/>
+        <a:font script="Nkoo" typeface="Ebrima"/>
+        <a:font script="Olck" typeface="Nirmala UI"/>
+        <a:font script="Osma" typeface="Ebrima"/>
+        <a:font script="Phag" typeface="Phagspa"/>
+        <a:font script="Syrn" typeface="Estrangelo Edessa"/>
+        <a:font script="Syrj" typeface="Estrangelo Edessa"/>
+        <a:font script="Syre" typeface="Estrangelo Edessa"/>
+        <a:font script="Sora" typeface="Nirmala UI"/>
+        <a:font script="Tale" typeface="Microsoft Tai Le"/>
+        <a:font script="Talu" typeface="Microsoft New Tai Lue"/>
+        <a:font script="Tfng" typeface="Ebrima"/>
+      </a:majorFont>
+      <a:minorFont>
+        <a:latin typeface="Calibri" panose="020F0502020204030204"/>
+        <a:ea typeface=""/>
+        <a:cs typeface=""/>
+        <a:font script="Jpan" typeface="游明朝"/>
+        <a:font script="Hang" typeface="맑은 고딕"/>
+        <a:font script="Hans" typeface="等线"/>
+        <a:font script="Hant" typeface="新細明體"/>
+        <a:font script="Arab" typeface="Arial"/>
+        <a:font script="Hebr" typeface="Arial"/>
+        <a:font script="Thai" typeface="Cordia New"/>
+        <a:font script="Ethi" typeface="Nyala"/>
+        <a:font script="Beng" typeface="Vrinda"/>
+        <a:font script="Gujr" typeface="Shruti"/>
+        <a:font script="Khmr" typeface="DaunPenh"/>
+        <a:font script="Knda" typeface="Tunga"/>
+        <a:font script="Guru" typeface="Raavi"/>
+        <a:font script="Cans" typeface="Euphemia"/>
+        <a:font script="Cher" typeface="Plantagenet Cherokee"/>
+        <a:font script="Yiii" typeface="Microsoft Yi Baiti"/>
+        <a:font script="Tibt" typeface="Microsoft Himalaya"/>
+        <a:font script="Thaa" typeface="MV Boli"/>
+        <a:font script="Deva" typeface="Mangal"/>
+        <a:font script="Telu" typeface="Gautami"/>
+        <a:font script="Taml" typeface="Latha"/>
+        <a:font script="Syrc" typeface="Estrangelo Edessa"/>
+        <a:font script="Orya" typeface="Kalinga"/>
+        <a:font script="Mlym" typeface="Kartika"/>
+        <a:font script="Laoo" typeface="DokChampa"/>
+        <a:font script="Sinh" typeface="Iskoola Pota"/>
+        <a:font script="Mong" typeface="Mongolian Baiti"/>
+        <a:font script="Viet" typeface="Arial"/>
+        <a:font script="Uigh" typeface="Microsoft Uighur"/>
+        <a:font script="Geor" typeface="Sylfaen"/>
+        <a:font script="Armn" typeface="Arial"/>
+        <a:font script="Bugi" typeface="Leelawadee UI"/>
+        <a:font script="Bopo" typeface="Microsoft JhengHei"/>
+        <a:font script="Java" typeface="Javanese Text"/>
+        <a:font script="Lisu" typeface="Segoe UI"/>
+        <a:font script="Mymr" typeface="Myanmar Text"/>
+        <a:font script="Nkoo" typeface="Ebrima"/>
+        <a:font script="Olck" typeface="Nirmala UI"/>
+        <a:font script="Osma" typeface="Ebrima"/>
+        <a:font script="Phag" typeface="Phagspa"/>
+        <a:font script="Syrn" typeface="Estrangelo Edessa"/>
+        <a:font script="Syrj" typeface="Estrangelo Edessa"/>
+        <a:font script="Syre" typeface="Estrangelo Edessa"/>
+        <a:font script="Sora" typeface="Nirmala UI"/>
+        <a:font script="Tale" typeface="Microsoft Tai Le"/>
+        <a:font script="Talu" typeface="Microsoft New Tai Lue"/>
+        <a:font script="Tfng" typeface="Ebrima"/>
+      </a:minorFont>
+    </a:fontScheme>
+    <a:fmtScheme name="Office">
+      <a:fillStyleLst>
+        <a:solidFill>
+          <a:schemeClr val="phClr"/>
+        </a:solidFill>
+        <a:gradFill rotWithShape="true">
+          <a:gsLst>
+            <a:gs pos="0">
+              <a:schemeClr val="phClr">
+                <a:lumMod val="110000"/>
+                <a:satMod val="105000"/>
+                <a:tint val="67000"/>
+              </a:schemeClr>
+            </a:gs>
+            <a:gs pos="50000">
+              <a:schemeClr val="phClr">
+                <a:lumMod val="105000"/>
+                <a:satMod val="103000"/>
+                <a:tint val="73000"/>
+              </a:schemeClr>
+            </a:gs>
+            <a:gs pos="100000">
+              <a:schemeClr val="phClr">
+                <a:lumMod val="105000"/>
+                <a:satMod val="109000"/>
+                <a:tint val="81000"/>
+              </a:schemeClr>
+            </a:gs>
+          </a:gsLst>
+          <a:lin ang="5400000" scaled="false"/>
+        </a:gradFill>
+        <a:gradFill rotWithShape="true">
+          <a:gsLst>
+            <a:gs pos="0">
+              <a:schemeClr val="phClr">
+                <a:satMod val="103000"/>
+                <a:lumMod val="102000"/>
+                <a:tint val="94000"/>
+              </a:schemeClr>
+            </a:gs>
+            <a:gs pos="50000">
+              <a:schemeClr val="phClr">
+                <a:satMod val="110000"/>
+                <a:lumMod val="100000"/>
+                <a:shade val="100000"/>
+              </a:schemeClr>
+            </a:gs>
+            <a:gs pos="100000">
+              <a:schemeClr val="phClr">
+                <a:lumMod val="99000"/>
+                <a:satMod val="120000"/>
+                <a:shade val="78000"/>
+              </a:schemeClr>
+            </a:gs>
+          </a:gsLst>
+          <a:lin ang="5400000" scaled="false"/>
+        </a:gradFill>
+      </a:fillStyleLst>
+      <a:lnStyleLst>
+        <a:ln w="6350" cap="flat" cmpd="sng" algn="ctr">
+          <a:solidFill>
+            <a:schemeClr val="phClr"/>
+          </a:solidFill>
+          <a:prstDash val="solid"/>
+          <a:miter lim="800000"/>
+        </a:ln>
+        <a:ln w="12700" cap="flat" cmpd="sng" algn="ctr">
+          <a:solidFill>
+            <a:schemeClr val="phClr"/>
+          </a:solidFill>
+          <a:prstDash val="solid"/>
+          <a:miter lim="800000"/>
+        </a:ln>
+        <a:ln w="19050" cap="flat" cmpd="sng" algn="ctr">
+          <a:solidFill>
+            <a:schemeClr val="phClr"/>
+          </a:solidFill>
+          <a:prstDash val="solid"/>
+          <a:miter lim="800000"/>
+        </a:ln>
+      </a:lnStyleLst>
+      <a:effectStyleLst>
+        <a:effectStyle>
+          <a:effectLst/>
+        </a:effectStyle>
+        <a:effectStyle>
+          <a:effectLst/>
+        </a:effectStyle>
+        <a:effectStyle>
+          <a:effectLst>
+            <a:outerShdw blurRad="57150" dist="19050" dir="5400000" algn="ctr" rotWithShape="false">
+              <a:srgbClr val="000000">
+                <a:alpha val="63000"/>
+              </a:srgbClr>
+            </a:outerShdw>
+          </a:effectLst>
+        </a:effectStyle>
+      </a:effectStyleLst>
+      <a:bgFillStyleLst>
+        <a:solidFill>
+          <a:schemeClr val="phClr"/>
+        </a:solidFill>
+        <a:solidFill>
+          <a:schemeClr val="phClr">
+            <a:tint val="95000"/>
+            <a:satMod val="170000"/>
+          </a:schemeClr>
+        </a:solidFill>
+        <a:gradFill rotWithShape="true">
+          <a:gsLst>
+            <a:gs pos="0">
+              <a:schemeClr val="phClr">
+                <a:tint val="93000"/>
+                <a:satMod val="150000"/>
+                <a:shade val="98000"/>
+                <a:lumMod val="102000"/>
+              </a:schemeClr>
+            </a:gs>
+            <a:gs pos="50000">
+              <a:schemeClr val="phClr">
+                <a:tint val="98000"/>
+                <a:satMod val="130000"/>
+                <a:shade val="90000"/>
+                <a:lumMod val="103000"/>
+              </a:schemeClr>
+            </a:gs>
+            <a:gs pos="100000">
+              <a:schemeClr val="phClr">
+                <a:shade val="63000"/>
+                <a:satMod val="120000"/>
+              </a:schemeClr>
+            </a:gs>
+          </a:gsLst>
+          <a:lin ang="5400000" scaled="false"/>
+        </a:gradFill>
+      </a:bgFillStyleLst>
+    </a:fmtScheme>
+  </a:themeElements>
+  <a:objectDefaults/>
+  <a:extraClrSchemeLst/>
+</a:theme>
 </file>
</xml_diff>